<commit_message>
Phase 3 Step B: segment, classify and file documents with audited unmasked originals (A35)
Deterministic signature library, bundle segmentation, classifier fallback,
party and period assignment, A32 supersession with undo, durable steps and
the intake, documents and filing review screens.

Record owner ruling A35: derived and stored data stay masked; originals open
unmasked for admin and operator roles only, one audit event per open, signed
no-store links, and startup refuses REAL_DATA_MODE with PUBLIC_DEMO_MODE.
Tests cover A35 conditions 1, 2 and 4; the review screen shows the notice.

Co-Authored-By: Claude Fable 5.1 <noreply@anthropic.com>
</commit_message>
<xml_diff>
--- a/fixtures/deals/deal-a/incoming/batch-1/Buyer/Attachments/plan.docx
+++ b/fixtures/deals/deal-a/incoming/batch-1/Buyer/Attachments/plan.docx
@@ -72,6 +72,18 @@
           <w:szCs w:val="20"/>
         </w:rPr>
         <w:t xml:space="preserve">Record: plan</w:t>
+      </w:r>
+    </w:p>
+    <w:p>
+      <w:pPr>
+        <w:spacing w:after="100"/>
+      </w:pPr>
+      <w:r>
+        <w:rPr>
+          <w:sz w:val="20"/>
+          <w:szCs w:val="20"/>
+        </w:rPr>
+        <w:t xml:space="preserve">Document date: 2026-08-31</w:t>
       </w:r>
     </w:p>
     <w:p>

</xml_diff>